<commit_message>
fix: generate valid WordprocessingML
Co-authored-by: Copilot App <223556219+Copilot@users.noreply.github.com>
</commit_message>
<xml_diff>
--- a/templates/apple-university-template.docx
+++ b/templates/apple-university-template.docx
@@ -3,10 +3,10 @@
 <w:document xmlns:wpc="http://schemas.microsoft.com/office/word/2010/wordprocessingCanvas" xmlns:mo="http://schemas.microsoft.com/office/mac/office/2008/main" xmlns:mc="http://schemas.openxmlformats.org/markup-compatibility/2006" xmlns:mv="urn:schemas-microsoft-com:mac:vml" xmlns:o="urn:schemas-microsoft-com:office:office" xmlns:r="http://schemas.openxmlformats.org/officeDocument/2006/relationships" xmlns:m="http://schemas.openxmlformats.org/officeDocument/2006/math" xmlns:v="urn:schemas-microsoft-com:vml" xmlns:wp14="http://schemas.microsoft.com/office/word/2010/wordprocessingDrawing" xmlns:wp="http://schemas.openxmlformats.org/drawingml/2006/wordprocessingDrawing" xmlns:w10="urn:schemas-microsoft-com:office:word" xmlns:w="http://schemas.openxmlformats.org/wordprocessingml/2006/main" xmlns:w14="http://schemas.microsoft.com/office/word/2010/wordml" xmlns:wpg="http://schemas.microsoft.com/office/word/2010/wordprocessingGroup" xmlns:wpi="http://schemas.microsoft.com/office/word/2010/wordprocessingInk" xmlns:wne="http://schemas.microsoft.com/office/word/2006/wordml" xmlns:wps="http://schemas.microsoft.com/office/word/2010/wordprocessingShape" mc:Ignorable="w14 wp14">
   <w:body>
     <w:p>
-      <w:bookmarkStart w:id="1" w:name="demo_cover"/>
       <w:pPr>
         <w:pStyle w:val="AppleTitleZH"/>
       </w:pPr>
+      <w:bookmarkStart w:id="1" w:name="demo_cover"/>
       <w:r>
         <w:t>中文论文题目</w:t>
       </w:r>
@@ -77,10 +77,10 @@
       </w:r>
     </w:p>
     <w:p>
-      <w:bookmarkStart w:id="2" w:name="demo_toc"/>
       <w:pPr>
         <w:pStyle w:val="AppleFrontHeading"/>
       </w:pPr>
+      <w:bookmarkStart w:id="2" w:name="demo_toc"/>
       <w:r>
         <w:t>目录</w:t>
       </w:r>
@@ -89,13 +89,19 @@
     <w:p>
       <w:r>
         <w:fldChar w:fldCharType="begin" w:dirty="true"/>
+      </w:r>
+      <w:r>
         <w:instrText xml:space="preserve"> TOC \o "1-3" \h \z \u </w:instrText>
+      </w:r>
+      <w:r>
         <w:fldChar w:fldCharType="separate"/>
       </w:r>
       <w:r>
         <w:t>更新字段后显示</w:t>
       </w:r>
-      <w:fldChar w:fldCharType="end"/>
+      <w:r>
+        <w:fldChar w:fldCharType="end"/>
+      </w:r>
     </w:p>
     <w:p>
       <w:pPr>
@@ -108,13 +114,19 @@
     <w:p>
       <w:r>
         <w:fldChar w:fldCharType="begin" w:dirty="true"/>
+      </w:r>
+      <w:r>
         <w:instrText xml:space="preserve"> TOC \h \z \c "图" </w:instrText>
+      </w:r>
+      <w:r>
         <w:fldChar w:fldCharType="separate"/>
       </w:r>
       <w:r>
         <w:t>更新字段后显示</w:t>
       </w:r>
-      <w:fldChar w:fldCharType="end"/>
+      <w:r>
+        <w:fldChar w:fldCharType="end"/>
+      </w:r>
     </w:p>
     <w:p>
       <w:pPr>
@@ -127,13 +139,19 @@
     <w:p>
       <w:r>
         <w:fldChar w:fldCharType="begin" w:dirty="true"/>
+      </w:r>
+      <w:r>
         <w:instrText xml:space="preserve"> TOC \h \z \c "表" </w:instrText>
+      </w:r>
+      <w:r>
         <w:fldChar w:fldCharType="separate"/>
       </w:r>
       <w:r>
         <w:t>更新字段后显示</w:t>
       </w:r>
-      <w:fldChar w:fldCharType="end"/>
+      <w:r>
+        <w:fldChar w:fldCharType="end"/>
+      </w:r>
     </w:p>
     <w:p>
       <w:pPr>
@@ -162,7 +180,6 @@
       </w:pPr>
     </w:p>
     <w:p>
-      <w:bookmarkStart w:id="3" w:name="demo_body"/>
       <w:pPr>
         <w:pStyle w:val="AppleHeading1"/>
         <w:numPr>
@@ -170,6 +187,7 @@
           <w:numId w:val="10"/>
         </w:numPr>
       </w:pPr>
+      <w:bookmarkStart w:id="3" w:name="demo_body"/>
       <w:r>
         <w:t>章节标题</w:t>
       </w:r>
@@ -196,11 +214,14 @@
       </w:r>
     </w:p>
     <w:p>
-      <w:bookmarkStart w:id="4" w:name="demo_figure"/>
       <w:pPr>
         <w:keepNext/>
         <w:jc w:val="center"/>
       </w:pPr>
+      <w:bookmarkStart w:id="4" w:name="demo_figure"/>
+      <w:r>
+        <w:t>[在此插入图形]</w:t>
+      </w:r>
       <w:bookmarkEnd w:id="4"/>
     </w:p>
     <w:p>
@@ -208,90 +229,100 @@
         <w:pStyle w:val="AppleFigureCaption"/>
       </w:pPr>
       <w:r>
-        <w:t>图 1-1 图题示例</w:t>
+        <w:t xml:space="preserve">图 </w:t>
       </w:r>
       <w:r>
         <w:fldChar w:fldCharType="begin" w:dirty="true"/>
+      </w:r>
+      <w:r>
         <w:instrText xml:space="preserve"> STYLEREF "AppleHeading1" \n </w:instrText>
+      </w:r>
+      <w:r>
         <w:fldChar w:fldCharType="separate"/>
       </w:r>
       <w:r>
-        <w:t/>
+        <w:t>1</w:t>
       </w:r>
-      <w:fldChar w:fldCharType="end"/>
+      <w:r>
+        <w:fldChar w:fldCharType="end"/>
+      </w:r>
+      <w:r>
+        <w:t>-</w:t>
+      </w:r>
       <w:r>
         <w:fldChar w:fldCharType="begin" w:dirty="true"/>
+      </w:r>
+      <w:r>
         <w:instrText xml:space="preserve"> SEQ 图 \s 1 \* ARABIC </w:instrText>
+      </w:r>
+      <w:r>
         <w:fldChar w:fldCharType="separate"/>
       </w:r>
       <w:r>
-        <w:t/>
-      </w:r>
-      <w:fldChar w:fldCharType="end"/>
-    </w:p>
-    <w:p>
-      <w:bookmarkStart w:id="5" w:name="demo_table"/>
-      <w:pPr>
-        <w:pStyle w:val="AppleTableCaption"/>
-      </w:pPr>
-      <w:r>
-        <w:t>表 1-1 表题示例</w:t>
+        <w:t>1</w:t>
       </w:r>
       <w:r>
-        <w:fldChar w:fldCharType="begin" w:dirty="true"/>
-        <w:instrText xml:space="preserve"> STYLEREF "AppleHeading1" \n </w:instrText>
-        <w:fldChar w:fldCharType="separate"/>
+        <w:fldChar w:fldCharType="end"/>
       </w:r>
       <w:r>
-        <w:t/>
+        <w:t xml:space="preserve"> 图题示例</w:t>
       </w:r>
-      <w:fldChar w:fldCharType="end"/>
-      <w:r>
-        <w:fldChar w:fldCharType="begin" w:dirty="true"/>
-        <w:instrText xml:space="preserve"> SEQ 表 \s 1 \* ARABIC </w:instrText>
-        <w:fldChar w:fldCharType="separate"/>
-      </w:r>
-      <w:r>
-        <w:t/>
-      </w:r>
-      <w:fldChar w:fldCharType="end"/>
-      <w:bookmarkEnd w:id="5"/>
     </w:p>
     <w:p>
       <w:pPr>
         <w:pStyle w:val="AppleTableCaption"/>
       </w:pPr>
+      <w:bookmarkStart w:id="5" w:name="demo_table"/>
       <w:r>
-        <w:t xml:space="preserve">表 1-1 </w:t>
+        <w:t xml:space="preserve">表 </w:t>
       </w:r>
       <w:r>
         <w:fldChar w:fldCharType="begin" w:dirty="true"/>
+      </w:r>
+      <w:r>
         <w:instrText xml:space="preserve"> STYLEREF "AppleHeading1" \n </w:instrText>
+      </w:r>
+      <w:r>
         <w:fldChar w:fldCharType="separate"/>
       </w:r>
       <w:r>
-        <w:t/>
+        <w:t>1</w:t>
       </w:r>
-      <w:fldChar w:fldCharType="end"/>
+      <w:r>
+        <w:fldChar w:fldCharType="end"/>
+      </w:r>
+      <w:r>
+        <w:t>-</w:t>
+      </w:r>
       <w:r>
         <w:fldChar w:fldCharType="begin" w:dirty="true"/>
+      </w:r>
+      <w:r>
         <w:instrText xml:space="preserve"> SEQ 表 \s 1 \* ARABIC </w:instrText>
+      </w:r>
+      <w:r>
         <w:fldChar w:fldCharType="separate"/>
       </w:r>
       <w:r>
-        <w:t/>
+        <w:t>1</w:t>
       </w:r>
-      <w:fldChar w:fldCharType="end"/>
+      <w:r>
+        <w:fldChar w:fldCharType="end"/>
+      </w:r>
+      <w:r>
+        <w:t xml:space="preserve"> 表题示例</w:t>
+      </w:r>
+      <w:bookmarkEnd w:id="5"/>
     </w:p>
     <w:tbl>
       <w:tblPr>
         <w:tblW w:type="auto" w:w="0"/>
-        <w:tblLayout w:type="fixed"/>
-        <w:tblLook w:firstColumn="1" w:firstRow="1" w:lastColumn="0" w:lastRow="0" w:noHBand="0" w:noVBand="1" w:val="04A0"/>
         <w:tblBorders>
           <w:top w:val="single" w:sz="8" w:color="000000"/>
           <w:bottom w:val="single" w:sz="8" w:color="000000"/>
         </w:tblBorders>
+        <w:tblLayout w:type="fixed"/>
+        <w:tblLook w:firstColumn="1" w:firstRow="1" w:lastColumn="0" w:lastRow="0" w:noHBand="0" w:noVBand="1" w:val="04A0"/>
       </w:tblPr>
       <w:tblGrid>
         <w:gridCol w:w="4252"/>
@@ -299,16 +330,16 @@
       </w:tblGrid>
       <w:tr>
         <w:trPr>
+          <w:cantSplit/>
           <w:tblHeader/>
-          <w:cantSplit/>
         </w:trPr>
         <w:tc>
           <w:tcPr>
             <w:tcW w:type="dxa" w:w="4252"/>
-            <w:vAlign w:val="center"/>
             <w:tcBorders>
               <w:bottom w:val="single" w:sz="6" w:color="000000"/>
             </w:tcBorders>
+            <w:vAlign w:val="center"/>
           </w:tcPr>
           <w:p>
             <w:pPr>
@@ -323,10 +354,10 @@
         <w:tc>
           <w:tcPr>
             <w:tcW w:type="dxa" w:w="4252"/>
-            <w:vAlign w:val="center"/>
             <w:tcBorders>
               <w:bottom w:val="single" w:sz="6" w:color="000000"/>
             </w:tcBorders>
+            <w:vAlign w:val="center"/>
           </w:tcPr>
           <w:p>
             <w:pPr>
@@ -375,17 +406,9 @@
     </w:tbl>
     <w:p>
       <w:pPr>
-        <w:pStyle w:val="AppleSourceNote"/>
-      </w:pPr>
-      <w:r>
-        <w:t>注：全部数值均为模拟数据。</w:t>
-      </w:r>
-    </w:p>
-    <w:p>
-      <w:bookmarkStart w:id="6" w:name="demo_references"/>
-      <w:pPr>
         <w:pStyle w:val="AppleFrontHeading"/>
       </w:pPr>
+      <w:bookmarkStart w:id="6" w:name="demo_references"/>
       <w:r>
         <w:t>参考文献</w:t>
       </w:r>
@@ -406,14 +429,13 @@
           <w:footerReference w:type="default" r:id="rId10"/>
           <w:pgSz w:w="11906" w:h="16838"/>
           <w:pgMar w:top="1701" w:right="1701" w:bottom="1701" w:left="1701" w:header="1247" w:footer="1247" w:gutter="0"/>
+          <w:pgNumType w:fmt="decimal" w:start="1"/>
           <w:cols w:space="720"/>
           <w:docGrid w:linePitch="360"/>
-          <w:pgNumType w:fmt="decimal" w:start="1"/>
         </w:sectPr>
       </w:pPr>
     </w:p>
     <w:p>
-      <w:bookmarkStart w:id="7" w:name="demo_appendix"/>
       <w:pPr>
         <w:pStyle w:val="AppleAppendixHeading"/>
         <w:numPr>
@@ -421,6 +443,7 @@
           <w:numId w:val="11"/>
         </w:numPr>
       </w:pPr>
+      <w:bookmarkStart w:id="7" w:name="demo_appendix"/>
       <w:r>
         <w:t>附录 A 附录标题</w:t>
       </w:r>
@@ -431,9 +454,9 @@
       <w:footerReference w:type="default" r:id="rId12"/>
       <w:pgSz w:w="11906" w:h="16838"/>
       <w:pgMar w:top="1701" w:right="1701" w:bottom="1701" w:left="1701" w:header="1247" w:footer="1247" w:gutter="0"/>
+      <w:pgNumType w:fmt="decimal" w:start="1"/>
       <w:cols w:space="720"/>
       <w:docGrid w:linePitch="360"/>
-      <w:pgNumType w:fmt="decimal" w:start="1"/>
     </w:sectPr>
   </w:body>
 </w:document>
@@ -447,13 +470,19 @@
     </w:pPr>
     <w:r>
       <w:fldChar w:fldCharType="begin" w:dirty="true"/>
+    </w:r>
+    <w:r>
       <w:instrText xml:space="preserve"> PAGE </w:instrText>
+    </w:r>
+    <w:r>
       <w:fldChar w:fldCharType="separate"/>
     </w:r>
     <w:r>
       <w:t>1</w:t>
     </w:r>
-    <w:fldChar w:fldCharType="end"/>
+    <w:r>
+      <w:fldChar w:fldCharType="end"/>
+    </w:r>
   </w:p>
 </w:ftr>
 </file>
@@ -466,13 +495,19 @@
     </w:pPr>
     <w:r>
       <w:fldChar w:fldCharType="begin" w:dirty="true"/>
+    </w:r>
+    <w:r>
       <w:instrText xml:space="preserve"> PAGE </w:instrText>
+    </w:r>
+    <w:r>
       <w:fldChar w:fldCharType="separate"/>
     </w:r>
     <w:r>
       <w:t>1</w:t>
     </w:r>
-    <w:fldChar w:fldCharType="end"/>
+    <w:r>
+      <w:fldChar w:fldCharType="end"/>
+    </w:r>
   </w:p>
 </w:ftr>
 </file>
@@ -485,13 +520,19 @@
     </w:pPr>
     <w:r>
       <w:fldChar w:fldCharType="begin" w:dirty="true"/>
+    </w:r>
+    <w:r>
       <w:instrText xml:space="preserve"> STYLEREF "AppleHeading1" </w:instrText>
+    </w:r>
+    <w:r>
       <w:fldChar w:fldCharType="separate"/>
     </w:r>
     <w:r>
       <w:t>标题</w:t>
     </w:r>
-    <w:fldChar w:fldCharType="end"/>
+    <w:r>
+      <w:fldChar w:fldCharType="end"/>
+    </w:r>
   </w:p>
 </w:hdr>
 </file>
@@ -504,13 +545,19 @@
     </w:pPr>
     <w:r>
       <w:fldChar w:fldCharType="begin" w:dirty="true"/>
+    </w:r>
+    <w:r>
       <w:instrText xml:space="preserve"> STYLEREF "AppleAppendixHeading" </w:instrText>
+    </w:r>
+    <w:r>
       <w:fldChar w:fldCharType="separate"/>
     </w:r>
     <w:r>
       <w:t>标题</w:t>
     </w:r>
-    <w:fldChar w:fldCharType="end"/>
+    <w:r>
+      <w:fldChar w:fldCharType="end"/>
+    </w:r>
   </w:p>
 </w:hdr>
 </file>
@@ -688,6 +735,39 @@
       </w:rPr>
     </w:lvl>
   </w:abstractNum>
+  <w:abstractNum w:abstractNumId="10">
+    <w:multiLevelType w:val="multilevel"/>
+    <w:lvl w:ilvl="0">
+      <w:start w:val="1"/>
+      <w:numFmt w:val="chineseCounting"/>
+      <w:pStyle w:val="AppleHeading1"/>
+      <w:suff w:val="space"/>
+      <w:lvlText w:val="第%1章"/>
+    </w:lvl>
+    <w:lvl w:ilvl="1">
+      <w:start w:val="1"/>
+      <w:numFmt w:val="decimal"/>
+      <w:pStyle w:val="AppleHeading2"/>
+      <w:suff w:val="space"/>
+      <w:lvlText w:val="%1.%2"/>
+    </w:lvl>
+    <w:lvl w:ilvl="2">
+      <w:start w:val="1"/>
+      <w:numFmt w:val="decimal"/>
+      <w:pStyle w:val="AppleHeading3"/>
+      <w:suff w:val="space"/>
+      <w:lvlText w:val="%1.%2.%3"/>
+    </w:lvl>
+  </w:abstractNum>
+  <w:abstractNum w:abstractNumId="11">
+    <w:lvl w:ilvl="0">
+      <w:start w:val="1"/>
+      <w:numFmt w:val="upperLetter"/>
+      <w:pStyle w:val="AppleAppendixHeading"/>
+      <w:suff w:val="space"/>
+      <w:lvlText w:val="附录 %1"/>
+    </w:lvl>
+  </w:abstractNum>
   <w:num w:numId="1">
     <w:abstractNumId w:val="8"/>
   </w:num>
@@ -715,42 +795,9 @@
   <w:num w:numId="9">
     <w:abstractNumId w:val="0"/>
   </w:num>
-  <w:abstractNum w:abstractNumId="10">
-    <w:multiLevelType w:val="multilevel"/>
-    <w:lvl w:ilvl="0">
-      <w:start w:val="1"/>
-      <w:numFmt w:val="chineseCounting"/>
-      <w:lvlText w:val="第%1章"/>
-      <w:suff w:val="space"/>
-      <w:pStyle w:val="AppleHeading1"/>
-    </w:lvl>
-    <w:lvl w:ilvl="1">
-      <w:start w:val="1"/>
-      <w:numFmt w:val="decimal"/>
-      <w:lvlText w:val="%1.%2"/>
-      <w:suff w:val="space"/>
-      <w:pStyle w:val="AppleHeading2"/>
-    </w:lvl>
-    <w:lvl w:ilvl="2">
-      <w:start w:val="1"/>
-      <w:numFmt w:val="decimal"/>
-      <w:lvlText w:val="%1.%2.%3"/>
-      <w:suff w:val="space"/>
-      <w:pStyle w:val="AppleHeading3"/>
-    </w:lvl>
-  </w:abstractNum>
   <w:num w:numId="10">
     <w:abstractNumId w:val="10"/>
   </w:num>
-  <w:abstractNum w:abstractNumId="11">
-    <w:lvl w:ilvl="0">
-      <w:start w:val="1"/>
-      <w:numFmt w:val="upperLetter"/>
-      <w:lvlText w:val="附录 %1"/>
-      <w:suff w:val="space"/>
-      <w:pStyle w:val="AppleAppendixHeading"/>
-    </w:lvl>
-  </w:abstractNum>
   <w:num w:numId="11">
     <w:abstractNumId w:val="11"/>
   </w:num>
@@ -12603,260 +12650,260 @@
   <w:style w:type="paragraph" w:customStyle="1" w:styleId="AppleTitleZH">
     <w:name w:val="AppleTitleZH"/>
     <w:pPr>
+      <w:keepNext/>
+      <w:pageBreakBefore w:val="0"/>
       <w:spacing w:before="0" w:after="240" w:lineRule="auto" w:line="300"/>
       <w:ind w:left="0"/>
       <w:jc w:val="center"/>
+    </w:pPr>
+    <w:rPr>
+      <w:rFonts w:ascii="Liberation Sans" w:hAnsi="Liberation Sans" w:eastAsia="Noto Sans CJK SC"/>
+      <w:b/>
+      <w:i w:val="0"/>
+      <w:sz w:val="52"/>
+    </w:rPr>
+  </w:style>
+  <w:style w:type="paragraph" w:customStyle="1" w:styleId="AppleTitleEN">
+    <w:name w:val="AppleTitleEN"/>
+    <w:pPr>
       <w:keepNext/>
       <w:pageBreakBefore w:val="0"/>
-    </w:pPr>
-    <w:rPr>
-      <w:rFonts w:ascii="Liberation Sans" w:hAnsi="Liberation Sans" w:eastAsia="Noto Sans CJK SC"/>
-      <w:sz w:val="52"/>
-      <w:b/>
-      <w:i w:val="0"/>
-    </w:rPr>
-  </w:style>
-  <w:style w:type="paragraph" w:customStyle="1" w:styleId="AppleTitleEN">
-    <w:name w:val="AppleTitleEN"/>
-    <w:pPr>
       <w:spacing w:before="0" w:after="240" w:lineRule="auto" w:line="300"/>
       <w:ind w:left="0"/>
       <w:jc w:val="center"/>
+    </w:pPr>
+    <w:rPr>
+      <w:rFonts w:ascii="Liberation Sans" w:hAnsi="Liberation Sans" w:eastAsia="Noto Sans CJK SC"/>
+      <w:b/>
+      <w:i w:val="0"/>
+      <w:sz w:val="44"/>
+    </w:rPr>
+  </w:style>
+  <w:style w:type="paragraph" w:customStyle="1" w:styleId="AppleFrontHeading">
+    <w:name w:val="AppleFrontHeading"/>
+    <w:pPr>
       <w:keepNext/>
       <w:pageBreakBefore w:val="0"/>
-    </w:pPr>
-    <w:rPr>
-      <w:rFonts w:ascii="Liberation Sans" w:hAnsi="Liberation Sans" w:eastAsia="Noto Sans CJK SC"/>
-      <w:sz w:val="44"/>
-      <w:b/>
-      <w:i w:val="0"/>
-    </w:rPr>
-  </w:style>
-  <w:style w:type="paragraph" w:customStyle="1" w:styleId="AppleFrontHeading">
-    <w:name w:val="AppleFrontHeading"/>
-    <w:pPr>
       <w:spacing w:before="480" w:after="360" w:lineRule="auto" w:line="240"/>
       <w:ind w:left="0"/>
       <w:jc w:val="center"/>
-      <w:keepNext/>
-      <w:pageBreakBefore w:val="0"/>
     </w:pPr>
     <w:rPr>
       <w:rFonts w:ascii="Liberation Sans" w:hAnsi="Liberation Sans" w:eastAsia="Noto Sans CJK SC"/>
-      <w:sz w:val="32"/>
       <w:b/>
       <w:i w:val="0"/>
+      <w:sz w:val="32"/>
     </w:rPr>
   </w:style>
   <w:style w:type="paragraph" w:customStyle="1" w:styleId="AppleHeading1">
     <w:name w:val="AppleHeading1"/>
     <w:pPr>
+      <w:keepNext/>
+      <w:pageBreakBefore/>
       <w:spacing w:before="480" w:after="360" w:lineRule="auto" w:line="240"/>
       <w:ind w:left="0"/>
       <w:jc w:val="center"/>
-      <w:keepNext/>
-      <w:pageBreakBefore/>
       <w:outlineLvl w:val="0"/>
     </w:pPr>
     <w:rPr>
       <w:rFonts w:ascii="Liberation Sans" w:hAnsi="Liberation Sans" w:eastAsia="Noto Sans CJK SC"/>
-      <w:sz w:val="32"/>
       <w:b/>
       <w:i w:val="0"/>
+      <w:sz w:val="32"/>
     </w:rPr>
   </w:style>
   <w:style w:type="paragraph" w:customStyle="1" w:styleId="AppleHeading2">
     <w:name w:val="AppleHeading2"/>
     <w:pPr>
+      <w:keepNext/>
+      <w:pageBreakBefore w:val="0"/>
       <w:spacing w:before="480" w:after="120" w:lineRule="exact" w:line="400"/>
       <w:ind w:left="0"/>
-      <w:jc w:val="left"/>
+      <w:jc w:val="start"/>
+      <w:outlineLvl w:val="1"/>
+    </w:pPr>
+    <w:rPr>
+      <w:rFonts w:ascii="Liberation Sans" w:hAnsi="Liberation Sans" w:eastAsia="Noto Sans CJK SC"/>
+      <w:b/>
+      <w:i w:val="0"/>
+      <w:sz w:val="28"/>
+    </w:rPr>
+  </w:style>
+  <w:style w:type="paragraph" w:customStyle="1" w:styleId="AppleHeading3">
+    <w:name w:val="AppleHeading3"/>
+    <w:pPr>
       <w:keepNext/>
       <w:pageBreakBefore w:val="0"/>
-      <w:outlineLvl w:val="1"/>
+      <w:spacing w:before="240" w:after="120" w:lineRule="exact" w:line="400"/>
+      <w:ind w:left="0"/>
+      <w:jc w:val="start"/>
+      <w:outlineLvl w:val="2"/>
     </w:pPr>
     <w:rPr>
       <w:rFonts w:ascii="Liberation Sans" w:hAnsi="Liberation Sans" w:eastAsia="Noto Sans CJK SC"/>
-      <w:sz w:val="28"/>
       <w:b/>
       <w:i w:val="0"/>
-    </w:rPr>
-  </w:style>
-  <w:style w:type="paragraph" w:customStyle="1" w:styleId="AppleHeading3">
-    <w:name w:val="AppleHeading3"/>
-    <w:pPr>
-      <w:spacing w:before="240" w:after="120" w:lineRule="exact" w:line="400"/>
-      <w:ind w:left="0"/>
-      <w:jc w:val="left"/>
-      <w:keepNext/>
-      <w:pageBreakBefore w:val="0"/>
-      <w:outlineLvl w:val="2"/>
-    </w:pPr>
-    <w:rPr>
-      <w:rFonts w:ascii="Liberation Sans" w:hAnsi="Liberation Sans" w:eastAsia="Noto Sans CJK SC"/>
       <w:sz w:val="26"/>
-      <w:b/>
-      <w:i w:val="0"/>
     </w:rPr>
   </w:style>
   <w:style w:type="paragraph" w:customStyle="1" w:styleId="AppleBody">
     <w:name w:val="AppleBody"/>
     <w:pPr>
+      <w:keepNext w:val="0"/>
+      <w:pageBreakBefore w:val="0"/>
       <w:spacing w:before="0" w:after="0" w:lineRule="exact" w:line="400"/>
       <w:ind w:left="0" w:firstLineChars="200"/>
-      <w:jc w:val="justify"/>
+      <w:jc w:val="both"/>
+    </w:pPr>
+    <w:rPr>
+      <w:rFonts w:ascii="Liberation Serif" w:hAnsi="Liberation Serif" w:eastAsia="Noto Serif CJK SC"/>
+      <w:b w:val="0"/>
+      <w:i w:val="0"/>
+      <w:sz w:val="24"/>
+    </w:rPr>
+  </w:style>
+  <w:style w:type="paragraph" w:customStyle="1" w:styleId="AppleAbstractZH">
+    <w:name w:val="AppleAbstractZH"/>
+    <w:pPr>
       <w:keepNext w:val="0"/>
       <w:pageBreakBefore w:val="0"/>
+      <w:spacing w:before="0" w:after="0" w:lineRule="exact" w:line="400"/>
+      <w:ind w:left="0" w:firstLineChars="200"/>
+      <w:jc w:val="both"/>
     </w:pPr>
     <w:rPr>
       <w:rFonts w:ascii="Liberation Serif" w:hAnsi="Liberation Serif" w:eastAsia="Noto Serif CJK SC"/>
-      <w:sz w:val="24"/>
       <w:b w:val="0"/>
       <w:i w:val="0"/>
+      <w:sz w:val="24"/>
     </w:rPr>
   </w:style>
-  <w:style w:type="paragraph" w:customStyle="1" w:styleId="AppleAbstractZH">
-    <w:name w:val="AppleAbstractZH"/>
-    <w:pPr>
-      <w:spacing w:before="0" w:after="0" w:lineRule="exact" w:line="400"/>
-      <w:ind w:left="0" w:firstLineChars="200"/>
-      <w:jc w:val="justify"/>
+  <w:style w:type="paragraph" w:customStyle="1" w:styleId="AppleAbstractEN">
+    <w:name w:val="AppleAbstractEN"/>
+    <w:pPr>
       <w:keepNext w:val="0"/>
       <w:pageBreakBefore w:val="0"/>
+      <w:spacing w:before="0" w:after="0" w:lineRule="exact" w:line="400"/>
+      <w:ind w:left="0"/>
+      <w:jc w:val="both"/>
     </w:pPr>
     <w:rPr>
       <w:rFonts w:ascii="Liberation Serif" w:hAnsi="Liberation Serif" w:eastAsia="Noto Serif CJK SC"/>
-      <w:sz w:val="24"/>
       <w:b w:val="0"/>
       <w:i w:val="0"/>
+      <w:sz w:val="24"/>
     </w:rPr>
   </w:style>
-  <w:style w:type="paragraph" w:customStyle="1" w:styleId="AppleAbstractEN">
-    <w:name w:val="AppleAbstractEN"/>
-    <w:pPr>
+  <w:style w:type="paragraph" w:customStyle="1" w:styleId="AppleKeywords">
+    <w:name w:val="AppleKeywords"/>
+    <w:pPr>
+      <w:keepNext w:val="0"/>
+      <w:pageBreakBefore w:val="0"/>
       <w:spacing w:before="0" w:after="0" w:lineRule="exact" w:line="400"/>
       <w:ind w:left="0"/>
-      <w:jc w:val="justify"/>
+      <w:jc w:val="start"/>
+    </w:pPr>
+    <w:rPr>
+      <w:rFonts w:ascii="Liberation Serif" w:hAnsi="Liberation Serif" w:eastAsia="Noto Serif CJK SC"/>
+      <w:b w:val="0"/>
+      <w:i w:val="0"/>
+      <w:sz w:val="24"/>
+    </w:rPr>
+  </w:style>
+  <w:style w:type="paragraph" w:customStyle="1" w:styleId="AppleFigureCaption">
+    <w:name w:val="AppleFigureCaption"/>
+    <w:pPr>
       <w:keepNext w:val="0"/>
       <w:pageBreakBefore w:val="0"/>
-    </w:pPr>
-    <w:rPr>
-      <w:rFonts w:ascii="Liberation Serif" w:hAnsi="Liberation Serif" w:eastAsia="Noto Serif CJK SC"/>
-      <w:sz w:val="24"/>
-      <w:b w:val="0"/>
-      <w:i w:val="0"/>
-    </w:rPr>
-  </w:style>
-  <w:style w:type="paragraph" w:customStyle="1" w:styleId="AppleKeywords">
-    <w:name w:val="AppleKeywords"/>
-    <w:pPr>
-      <w:spacing w:before="0" w:after="0" w:lineRule="exact" w:line="400"/>
-      <w:ind w:left="0"/>
-      <w:jc w:val="left"/>
-      <w:keepNext w:val="0"/>
-      <w:pageBreakBefore w:val="0"/>
-    </w:pPr>
-    <w:rPr>
-      <w:rFonts w:ascii="Liberation Serif" w:hAnsi="Liberation Serif" w:eastAsia="Noto Serif CJK SC"/>
-      <w:sz w:val="24"/>
-      <w:b w:val="0"/>
-      <w:i w:val="0"/>
-    </w:rPr>
-  </w:style>
-  <w:style w:type="paragraph" w:customStyle="1" w:styleId="AppleFigureCaption">
-    <w:name w:val="AppleFigureCaption"/>
-    <w:pPr>
       <w:spacing w:before="120" w:after="240" w:lineRule="auto" w:line="240"/>
       <w:ind w:left="0"/>
       <w:jc w:val="center"/>
-      <w:keepNext w:val="0"/>
-      <w:pageBreakBefore w:val="0"/>
     </w:pPr>
     <w:rPr>
       <w:rFonts w:ascii="Liberation Serif" w:hAnsi="Liberation Serif" w:eastAsia="Noto Serif CJK SC"/>
-      <w:sz w:val="22"/>
       <w:b w:val="0"/>
       <w:i w:val="0"/>
+      <w:sz w:val="22"/>
     </w:rPr>
   </w:style>
   <w:style w:type="paragraph" w:customStyle="1" w:styleId="AppleTableCaption">
     <w:name w:val="AppleTableCaption"/>
     <w:pPr>
+      <w:keepNext/>
+      <w:pageBreakBefore w:val="0"/>
       <w:spacing w:before="240" w:after="120" w:lineRule="auto" w:line="240"/>
       <w:ind w:left="0"/>
       <w:jc w:val="center"/>
-      <w:keepNext/>
-      <w:pageBreakBefore w:val="0"/>
     </w:pPr>
     <w:rPr>
       <w:rFonts w:ascii="Liberation Serif" w:hAnsi="Liberation Serif" w:eastAsia="Noto Serif CJK SC"/>
-      <w:sz w:val="22"/>
       <w:b w:val="0"/>
       <w:i w:val="0"/>
+      <w:sz w:val="22"/>
     </w:rPr>
   </w:style>
   <w:style w:type="paragraph" w:customStyle="1" w:styleId="AppleSourceNote">
     <w:name w:val="AppleSourceNote"/>
     <w:pPr>
+      <w:keepNext w:val="0"/>
+      <w:pageBreakBefore w:val="0"/>
       <w:spacing w:before="120" w:after="240" w:lineRule="auto" w:line="240"/>
       <w:ind w:left="0"/>
-      <w:jc w:val="left"/>
+      <w:jc w:val="start"/>
+    </w:pPr>
+    <w:rPr>
+      <w:rFonts w:ascii="Liberation Serif" w:hAnsi="Liberation Serif" w:eastAsia="Noto Serif CJK SC"/>
+      <w:b w:val="0"/>
+      <w:i w:val="0"/>
+      <w:sz w:val="21"/>
+    </w:rPr>
+  </w:style>
+  <w:style w:type="paragraph" w:customStyle="1" w:styleId="AppleTableBody">
+    <w:name w:val="AppleTableBody"/>
+    <w:pPr>
       <w:keepNext w:val="0"/>
       <w:pageBreakBefore w:val="0"/>
+      <w:spacing w:before="0" w:after="0" w:lineRule="auto" w:line="240"/>
+      <w:ind w:left="0"/>
+      <w:jc w:val="start"/>
     </w:pPr>
     <w:rPr>
       <w:rFonts w:ascii="Liberation Serif" w:hAnsi="Liberation Serif" w:eastAsia="Noto Serif CJK SC"/>
-      <w:sz w:val="21"/>
       <w:b w:val="0"/>
       <w:i w:val="0"/>
+      <w:sz w:val="22"/>
     </w:rPr>
   </w:style>
-  <w:style w:type="paragraph" w:customStyle="1" w:styleId="AppleTableBody">
-    <w:name w:val="AppleTableBody"/>
-    <w:pPr>
-      <w:spacing w:before="0" w:after="0" w:lineRule="auto" w:line="240"/>
-      <w:ind w:left="0"/>
-      <w:jc w:val="left"/>
+  <w:style w:type="paragraph" w:customStyle="1" w:styleId="AppleReference">
+    <w:name w:val="AppleReference"/>
+    <w:pPr>
       <w:keepNext w:val="0"/>
       <w:pageBreakBefore w:val="0"/>
+      <w:spacing w:before="0" w:after="0" w:lineRule="exact" w:line="320"/>
+      <w:ind w:left="0" w:hanging="567"/>
+      <w:jc w:val="start"/>
     </w:pPr>
     <w:rPr>
       <w:rFonts w:ascii="Liberation Serif" w:hAnsi="Liberation Serif" w:eastAsia="Noto Serif CJK SC"/>
-      <w:sz w:val="22"/>
       <w:b w:val="0"/>
       <w:i w:val="0"/>
-    </w:rPr>
-  </w:style>
-  <w:style w:type="paragraph" w:customStyle="1" w:styleId="AppleReference">
-    <w:name w:val="AppleReference"/>
-    <w:pPr>
-      <w:spacing w:before="0" w:after="0" w:lineRule="exact" w:line="320"/>
-      <w:ind w:left="0" w:hanging="567"/>
-      <w:jc w:val="left"/>
-      <w:keepNext w:val="0"/>
-      <w:pageBreakBefore w:val="0"/>
-    </w:pPr>
-    <w:rPr>
-      <w:rFonts w:ascii="Liberation Serif" w:hAnsi="Liberation Serif" w:eastAsia="Noto Serif CJK SC"/>
       <w:sz w:val="21"/>
-      <w:b w:val="0"/>
-      <w:i w:val="0"/>
     </w:rPr>
   </w:style>
   <w:style w:type="paragraph" w:customStyle="1" w:styleId="AppleAppendixHeading">
     <w:name w:val="AppleAppendixHeading"/>
     <w:pPr>
+      <w:keepNext/>
+      <w:pageBreakBefore/>
       <w:spacing w:before="480" w:after="360" w:lineRule="auto" w:line="240"/>
       <w:ind w:left="0"/>
       <w:jc w:val="center"/>
-      <w:keepNext/>
-      <w:pageBreakBefore/>
     </w:pPr>
     <w:rPr>
       <w:rFonts w:ascii="Liberation Sans" w:hAnsi="Liberation Sans" w:eastAsia="Noto Sans CJK SC"/>
-      <w:sz w:val="32"/>
       <w:b/>
       <w:i w:val="0"/>
+      <w:sz w:val="32"/>
     </w:rPr>
   </w:style>
 </w:styles>

</xml_diff>

<commit_message>
fix: avoid duplicate appendix prefixes
Co-authored-by: Copilot App <223556219+Copilot@users.noreply.github.com>
</commit_message>
<xml_diff>
--- a/templates/apple-university-template.docx
+++ b/templates/apple-university-template.docx
@@ -445,7 +445,7 @@
       </w:pPr>
       <w:bookmarkStart w:id="7" w:name="demo_appendix"/>
       <w:r>
-        <w:t>附录 A 附录标题</w:t>
+        <w:t>附录标题</w:t>
       </w:r>
       <w:bookmarkEnd w:id="7"/>
     </w:p>
@@ -547,13 +547,31 @@
       <w:fldChar w:fldCharType="begin" w:dirty="true"/>
     </w:r>
     <w:r>
+      <w:instrText xml:space="preserve"> STYLEREF "AppleAppendixHeading" \n </w:instrText>
+    </w:r>
+    <w:r>
+      <w:fldChar w:fldCharType="separate"/>
+    </w:r>
+    <w:r>
+      <w:t>附录 A</w:t>
+    </w:r>
+    <w:r>
+      <w:fldChar w:fldCharType="end"/>
+    </w:r>
+    <w:r>
+      <w:t xml:space="preserve"> </w:t>
+    </w:r>
+    <w:r>
+      <w:fldChar w:fldCharType="begin" w:dirty="true"/>
+    </w:r>
+    <w:r>
       <w:instrText xml:space="preserve"> STYLEREF "AppleAppendixHeading" </w:instrText>
     </w:r>
     <w:r>
       <w:fldChar w:fldCharType="separate"/>
     </w:r>
     <w:r>
-      <w:t>标题</w:t>
+      <w:t>附录标题</w:t>
     </w:r>
     <w:r>
       <w:fldChar w:fldCharType="end"/>

</xml_diff>